<commit_message>
[UPDATE] documentetion and dataset
</commit_message>
<xml_diff>
--- a/docs/eden/UIST_EDEN_Information_and_Approval_Request.docx
+++ b/docs/eden/UIST_EDEN_Information_and_Approval_Request.docx
@@ -583,7 +583,7 @@
                 <w:color w:val="1F1F1F"/>
                 <w:sz w:val="18"/>
               </w:rPr>
-              <w:t>Confirm an existing UIST Handle prefix or authorize registration of a new prefix, and clarify DOI support.</w:t>
+              <w:t>Maintain the live UIST Handle prefix 20.500.15029; document service ownership, migration coverage and continuity, and clarify DOI support.</w:t>
             </w:r>
           </w:p>
         </w:tc>
@@ -1880,11 +1880,9 @@
         <w:rPr>
           <w:b/>
         </w:rPr>
-        <w:t xml:space="preserve">The current prefix 123456789 is a common DSpace example value. </w:t>
+        <w:t>Updated 6 October 2026: UIST Handle prefix 20.500.15029 is registered and live, matching the local backend declaration. https://hdl.handle.net/20.500.15029/261 resolves globally to the correct public item, Privacy Risks and Security Threats in Online Social Networks. Historical 123456789 values are DSpace example-prefix identifiers. Complete legacy migration and redirect coverage, new-item minting and restart resilience require separate evidence.</w:t>
       </w:r>
-      <w:r>
-        <w:t>A local URL such as /handle/123456789/261 is not proof of a globally registered UIST Handle. UIST must not claim Handle PID support until it controls a registered prefix and the identifiers resolve through hdl.handle.net.</w:t>
-      </w:r>
+      <w:r/>
     </w:p>
     <w:tbl>
       <w:tblPr>
@@ -2020,7 +2018,7 @@
                 <w:color w:val="1F1F1F"/>
                 <w:sz w:val="18"/>
               </w:rPr>
-              <w:t>Existing prefix</w:t>
+              <w:t>Registered prefix</w:t>
             </w:r>
           </w:p>
         </w:tc>
@@ -2047,7 +2045,7 @@
                 <w:color w:val="1F1F1F"/>
                 <w:sz w:val="18"/>
               </w:rPr>
-              <w:t>Does UIST already own or have authority to use a registered Handle prefix?</w:t>
+              <w:t>Registered prefix 20.500.15029 is live; confirm the accountable provider and institutional service owner.</w:t>
             </w:r>
           </w:p>
         </w:tc>
@@ -2074,7 +2072,7 @@
                 <w:color w:val="1F1F1F"/>
                 <w:sz w:val="18"/>
               </w:rPr>
-              <w:t>If yes: prefix, provider, contract owner, service administrator, and evidence of authorization</w:t>
+              <w:t>Prefix 20.500.15029; reference HNRT-185049. Record provider, contract owner, service administrator and authorization custody.</w:t>
             </w:r>
           </w:p>
         </w:tc>
@@ -2106,7 +2104,7 @@
                 <w:color w:val="1F1F1F"/>
                 <w:sz w:val="18"/>
               </w:rPr>
-              <w:t>New registration</w:t>
+              <w:t>Live resolution</w:t>
             </w:r>
           </w:p>
         </w:tc>
@@ -2133,7 +2131,7 @@
                 <w:color w:val="1F1F1F"/>
                 <w:sz w:val="18"/>
               </w:rPr>
-              <w:t>If no prefix exists, will UIST authorize registration through Handle.Net or an approved provider?</w:t>
+              <w:t>Sample 20.500.15029/261 resolved globally on 6 October 2026; retain this evidence and monitor representative public records.</w:t>
             </w:r>
           </w:p>
         </w:tc>
@@ -2160,7 +2158,7 @@
                 <w:color w:val="1F1F1F"/>
                 <w:sz w:val="18"/>
               </w:rPr>
-              <w:t>Decision, budget owner, contracting owner, and target date</w:t>
+              <w:t>Dated resolver result: HTTP 302 to the repository Handle route, HTTP 301 to the correct item page, then HTTP 200.</w:t>
             </w:r>
           </w:p>
         </w:tc>
@@ -2305,7 +2303,7 @@
                 <w:color w:val="1F1F1F"/>
                 <w:sz w:val="18"/>
               </w:rPr>
-              <w:t>Should existing 123456789 identifiers be migrated, aliased, or retained only as legacy local routes?</w:t>
+              <w:t>Audit complete migration and redirect coverage for historical 123456789 identifiers; the verified public sample now uses 20.500.15029/261.</w:t>
             </w:r>
           </w:p>
         </w:tc>
@@ -4543,7 +4541,7 @@
         <w:ind w:left="230" w:hanging="230"/>
       </w:pPr>
       <w:r>
-        <w:t>[ ] Verified Handle and DOI position.</w:t>
+        <w:t>[x] Live Handle sample resolution verified 6 October 2026. [ ] Confirm the separate DOI position.</w:t>
       </w:r>
     </w:p>
     <w:p>
@@ -5715,7 +5713,7 @@
         <w:ind w:left="230" w:hanging="230"/>
       </w:pPr>
       <w:r>
-        <w:t>[ ] A Handle decision with proof of an existing UIST prefix or authorization to acquire one, plus the legacy identifier and operating model decisions.</w:t>
+        <w:t>[x] Registered UIST prefix 20.500.15029 and global sample resolution verified 6 October 2026. [ ] Complete legacy-identifier coverage and operating-model evidence.</w:t>
       </w:r>
     </w:p>
     <w:p>
@@ -6247,7 +6245,7 @@
         <w:ind w:left="230" w:hanging="230"/>
       </w:pPr>
       <w:r>
-        <w:t>[ ] Handle and DOI decisions approved.</w:t>
+        <w:t>[x] UIST Handle prefix is registered and live; sample resolution verified. [ ] Confirm remaining operating responsibilities and the separate DOI decision.</w:t>
       </w:r>
     </w:p>
     <w:p>

</xml_diff>